<commit_message>
Semana 4: impacto social y responsabilidad (workshop, model card, datasheet, auditoría de equidad por jurisdicción, pt en revisión obligatoria, diapositiva 16)
Co-Authored-By: Claude Fable 5.1 <noreply@anthropic.com>
Claude-Session: https://claude.ai/code/session_01WoNHoUaGaerBW2JnaGJH3V
</commit_message>
<xml_diff>
--- a/docs/presentacion_final/Grupo_9_Guion_Video_Presentacion_Final.docx
+++ b/docs/presentacion_final/Grupo_9_Guion_Video_Presentacion_Final.docx
@@ -789,7 +789,7 @@
               <w:rPr>
                 <w:b w:val="0"/>
               </w:rPr>
-              <w:t>Guion de grabación del video de 15 minutos que acompaña la presentación final del Proyecto Integrador: ficha técnica, escaleta con tiempos por diapositiva, cobertura de los elementos evaluados, texto completo por bloque con indicación de pantalla y notas de grabación. Cubre problema, datos, diseño experimental, resultados, operación, limitaciones y conclusiones del clasificador de normativa sobre IA del corpus GENIAL.</w:t>
+              <w:t>Guion de grabación del video de 15 minutos que acompaña la presentación final del Proyecto Integrador: ficha técnica, escaleta con tiempos por diapositiva, cobertura de los elementos evaluados, texto completo por bloque con indicación de pantalla y notas de grabación. Cubre problema, datos, diseño experimental, resultados, impacto social, operación, limitaciones y conclusiones del clasificador de normativa sobre IA del corpus GENIAL.</w:t>
             </w:r>
           </w:p>
         </w:tc>
@@ -1318,7 +1318,7 @@
           <w:sz w:val="19"/>
           <w:szCs w:val="19"/>
         </w:rPr>
-        <w:t xml:space="preserve"> (18 diapositivas). Cada bloque indica la diapositiva, el minuto de inicio y fin, lo que aparece en pantalla y el texto que se lee en cámara. El mismo texto está en las notas del orador de cada diapositiva.</w:t>
+        <w:t xml:space="preserve"> (19 diapositivas). Cada bloque indica la diapositiva, el minuto de inicio y fin, lo que aparece en pantalla y el texto que se lee en cámara. El mismo texto está en las notas del orador de cada diapositiva.</w:t>
       </w:r>
     </w:p>
     <w:p>
@@ -1401,7 +1401,7 @@
                 <w:sz w:val="15"/>
                 <w:szCs w:val="15"/>
               </w:rPr>
-              <w:t xml:space="preserve">15:00 (18 diapositivas; la portada y el cierre ocupan 40 segundos en total).</w:t>
+              <w:t xml:space="preserve">15:00 (19 diapositivas; la portada y el cierre ocupan 40 segundos en total).</w:t>
             </w:r>
           </w:p>
         </w:tc>
@@ -1459,7 +1459,7 @@
                 <w:sz w:val="15"/>
                 <w:szCs w:val="15"/>
               </w:rPr>
-              <w:t xml:space="preserve">2258 palabras · ritmo de lectura ≈ 150 palabras por minuto (académico, pausado). Si el ensayo supera los 15:30, recortar primero los bloques 6, 7 y 14 (los más densos); si queda corto, ampliar las pausas en las diapositivas con figuras (10 y 15).</w:t>
+              <w:t xml:space="preserve">2339 palabras · ritmo de lectura ≈ 150 palabras por minuto (académico, pausado). Si el ensayo supera los 15:30, recortar primero los bloques 6, 7, 14 y 16 (los más densos); si queda corto, ampliar las pausas en las diapositivas con figuras (10 y 15).</w:t>
             </w:r>
           </w:p>
         </w:tc>
@@ -1575,7 +1575,7 @@
                 <w:sz w:val="15"/>
                 <w:szCs w:val="15"/>
               </w:rPr>
-              <w:t xml:space="preserve">Se sugiere alternar: Jorge bloques 1-8 y 15-18; Melissa bloques 9-14 (resultados). Cambiar de voz en los cambios de sección, no a mitad de bloque.</w:t>
+              <w:t xml:space="preserve">Se sugiere alternar: Jorge bloques 1-8 y 15-19; Melissa bloques 9-14 (resultados). Cambiar de voz en los cambios de sección, no a mitad de bloque.</w:t>
             </w:r>
           </w:p>
         </w:tc>
@@ -4277,7 +4277,7 @@
                 <w:sz w:val="14"/>
                 <w:szCs w:val="14"/>
               </w:rPr>
-              <w:t xml:space="preserve">13:25</w:t>
+              <w:t xml:space="preserve">13:10</w:t>
             </w:r>
           </w:p>
         </w:tc>
@@ -4302,7 +4302,7 @@
                 <w:sz w:val="14"/>
                 <w:szCs w:val="14"/>
               </w:rPr>
-              <w:t xml:space="preserve">60 s</w:t>
+              <w:t xml:space="preserve">45 s</w:t>
             </w:r>
           </w:p>
         </w:tc>
@@ -4327,7 +4327,7 @@
                 <w:sz w:val="14"/>
                 <w:szCs w:val="14"/>
               </w:rPr>
-              <w:t xml:space="preserve">143</w:t>
+              <w:t xml:space="preserve">123</w:t>
             </w:r>
           </w:p>
         </w:tc>
@@ -4384,7 +4384,7 @@
                 <w:sz w:val="14"/>
                 <w:szCs w:val="14"/>
               </w:rPr>
-              <w:t xml:space="preserve">Contraste con los umbrales prefijados y limitaciones</w:t>
+              <w:t xml:space="preserve">Impacto social y responsabilidad</w:t>
             </w:r>
           </w:p>
         </w:tc>
@@ -4410,7 +4410,7 @@
                 <w:sz w:val="14"/>
                 <w:szCs w:val="14"/>
               </w:rPr>
-              <w:t xml:space="preserve">13:25</w:t>
+              <w:t xml:space="preserve">13:10</w:t>
             </w:r>
           </w:p>
         </w:tc>
@@ -4436,7 +4436,7 @@
                 <w:sz w:val="14"/>
                 <w:szCs w:val="14"/>
               </w:rPr>
-              <w:t xml:space="preserve">14:10</w:t>
+              <w:t xml:space="preserve">13:55</w:t>
             </w:r>
           </w:p>
         </w:tc>
@@ -4488,7 +4488,7 @@
                 <w:sz w:val="14"/>
                 <w:szCs w:val="14"/>
               </w:rPr>
-              <w:t xml:space="preserve">117</w:t>
+              <w:t xml:space="preserve">135</w:t>
             </w:r>
           </w:p>
         </w:tc>
@@ -4543,7 +4543,7 @@
                 <w:sz w:val="14"/>
                 <w:szCs w:val="14"/>
               </w:rPr>
-              <w:t xml:space="preserve">Conclusiones y trabajo futuro</w:t>
+              <w:t xml:space="preserve">Contraste con los umbrales prefijados y limitaciones</w:t>
             </w:r>
           </w:p>
         </w:tc>
@@ -4568,7 +4568,7 @@
                 <w:sz w:val="14"/>
                 <w:szCs w:val="14"/>
               </w:rPr>
-              <w:t xml:space="preserve">14:10</w:t>
+              <w:t xml:space="preserve">13:55</w:t>
             </w:r>
           </w:p>
         </w:tc>
@@ -4593,7 +4593,7 @@
                 <w:sz w:val="14"/>
                 <w:szCs w:val="14"/>
               </w:rPr>
-              <w:t xml:space="preserve">14:50</w:t>
+              <w:t xml:space="preserve">14:25</w:t>
             </w:r>
           </w:p>
         </w:tc>
@@ -4618,7 +4618,7 @@
                 <w:sz w:val="14"/>
                 <w:szCs w:val="14"/>
               </w:rPr>
-              <w:t xml:space="preserve">40 s</w:t>
+              <w:t xml:space="preserve">30 s</w:t>
             </w:r>
           </w:p>
         </w:tc>
@@ -4643,7 +4643,7 @@
                 <w:sz w:val="14"/>
                 <w:szCs w:val="14"/>
               </w:rPr>
-              <w:t xml:space="preserve">144</w:t>
+              <w:t xml:space="preserve">117</w:t>
             </w:r>
           </w:p>
         </w:tc>
@@ -4700,7 +4700,7 @@
                 <w:sz w:val="14"/>
                 <w:szCs w:val="14"/>
               </w:rPr>
-              <w:t xml:space="preserve">Cierre</w:t>
+              <w:t xml:space="preserve">Conclusiones y trabajo futuro</w:t>
             </w:r>
           </w:p>
         </w:tc>
@@ -4726,7 +4726,7 @@
                 <w:sz w:val="14"/>
                 <w:szCs w:val="14"/>
               </w:rPr>
-              <w:t xml:space="preserve">14:50</w:t>
+              <w:t xml:space="preserve">14:25</w:t>
             </w:r>
           </w:p>
         </w:tc>
@@ -4752,7 +4752,7 @@
                 <w:sz w:val="14"/>
                 <w:szCs w:val="14"/>
               </w:rPr>
-              <w:t xml:space="preserve">15:00</w:t>
+              <w:t xml:space="preserve">14:50</w:t>
             </w:r>
           </w:p>
         </w:tc>
@@ -4778,7 +4778,7 @@
                 <w:sz w:val="14"/>
                 <w:szCs w:val="14"/>
               </w:rPr>
-              <w:t xml:space="preserve">10 s</w:t>
+              <w:t xml:space="preserve">25 s</w:t>
             </w:r>
           </w:p>
         </w:tc>
@@ -4786,6 +4786,161 @@
           <w:tcPr>
             <w:tcW w:type="dxa" w:w="1349"/>
             <w:shd w:fill="F3F1EE" w:color="auto" w:val="clear"/>
+            <w:tcMar>
+              <w:top w:type="dxa" w:w="60"/>
+              <w:left w:type="dxa" w:w="80"/>
+              <w:bottom w:type="dxa" w:w="60"/>
+              <w:right w:type="dxa" w:w="80"/>
+            </w:tcMar>
+            <w:vAlign w:val="top"/>
+          </w:tcPr>
+          <w:p>
+            <w:pPr>
+              <w:spacing w:after="40" w:line="240"/>
+              <w:jc w:val="left"/>
+            </w:pPr>
+            <w:r>
+              <w:rPr>
+                <w:sz w:val="14"/>
+                <w:szCs w:val="14"/>
+              </w:rPr>
+              <w:t xml:space="preserve">110</w:t>
+            </w:r>
+          </w:p>
+        </w:tc>
+      </w:tr>
+      <w:tr>
+        <w:trPr>
+          <w:cantSplit w:val="false"/>
+        </w:trPr>
+        <w:tc>
+          <w:tcPr>
+            <w:tcW w:type="dxa" w:w="519"/>
+            <w:tcMar>
+              <w:top w:type="dxa" w:w="60"/>
+              <w:left w:type="dxa" w:w="80"/>
+              <w:bottom w:type="dxa" w:w="60"/>
+              <w:right w:type="dxa" w:w="80"/>
+            </w:tcMar>
+            <w:vAlign w:val="top"/>
+          </w:tcPr>
+          <w:p>
+            <w:pPr>
+              <w:spacing w:after="40" w:line="240"/>
+              <w:jc w:val="left"/>
+            </w:pPr>
+            <w:r>
+              <w:rPr>
+                <w:sz w:val="14"/>
+                <w:szCs w:val="14"/>
+              </w:rPr>
+              <w:t xml:space="preserve">19</w:t>
+            </w:r>
+          </w:p>
+        </w:tc>
+        <w:tc>
+          <w:tcPr>
+            <w:tcW w:type="dxa" w:w="4536"/>
+            <w:tcMar>
+              <w:top w:type="dxa" w:w="60"/>
+              <w:left w:type="dxa" w:w="80"/>
+              <w:bottom w:type="dxa" w:w="60"/>
+              <w:right w:type="dxa" w:w="80"/>
+            </w:tcMar>
+            <w:vAlign w:val="top"/>
+          </w:tcPr>
+          <w:p>
+            <w:pPr>
+              <w:spacing w:after="40" w:line="240"/>
+              <w:jc w:val="left"/>
+            </w:pPr>
+            <w:r>
+              <w:rPr>
+                <w:sz w:val="14"/>
+                <w:szCs w:val="14"/>
+              </w:rPr>
+              <w:t xml:space="preserve">Cierre</w:t>
+            </w:r>
+          </w:p>
+        </w:tc>
+        <w:tc>
+          <w:tcPr>
+            <w:tcW w:type="dxa" w:w="934"/>
+            <w:tcMar>
+              <w:top w:type="dxa" w:w="60"/>
+              <w:left w:type="dxa" w:w="80"/>
+              <w:bottom w:type="dxa" w:w="60"/>
+              <w:right w:type="dxa" w:w="80"/>
+            </w:tcMar>
+            <w:vAlign w:val="top"/>
+          </w:tcPr>
+          <w:p>
+            <w:pPr>
+              <w:spacing w:after="40" w:line="240"/>
+              <w:jc w:val="left"/>
+            </w:pPr>
+            <w:r>
+              <w:rPr>
+                <w:sz w:val="14"/>
+                <w:szCs w:val="14"/>
+              </w:rPr>
+              <w:t xml:space="preserve">14:50</w:t>
+            </w:r>
+          </w:p>
+        </w:tc>
+        <w:tc>
+          <w:tcPr>
+            <w:tcW w:type="dxa" w:w="934"/>
+            <w:tcMar>
+              <w:top w:type="dxa" w:w="60"/>
+              <w:left w:type="dxa" w:w="80"/>
+              <w:bottom w:type="dxa" w:w="60"/>
+              <w:right w:type="dxa" w:w="80"/>
+            </w:tcMar>
+            <w:vAlign w:val="top"/>
+          </w:tcPr>
+          <w:p>
+            <w:pPr>
+              <w:spacing w:after="40" w:line="240"/>
+              <w:jc w:val="left"/>
+            </w:pPr>
+            <w:r>
+              <w:rPr>
+                <w:sz w:val="14"/>
+                <w:szCs w:val="14"/>
+              </w:rPr>
+              <w:t xml:space="preserve">15:00</w:t>
+            </w:r>
+          </w:p>
+        </w:tc>
+        <w:tc>
+          <w:tcPr>
+            <w:tcW w:type="dxa" w:w="1141"/>
+            <w:tcMar>
+              <w:top w:type="dxa" w:w="60"/>
+              <w:left w:type="dxa" w:w="80"/>
+              <w:bottom w:type="dxa" w:w="60"/>
+              <w:right w:type="dxa" w:w="80"/>
+            </w:tcMar>
+            <w:vAlign w:val="top"/>
+          </w:tcPr>
+          <w:p>
+            <w:pPr>
+              <w:spacing w:after="40" w:line="240"/>
+              <w:jc w:val="left"/>
+            </w:pPr>
+            <w:r>
+              <w:rPr>
+                <w:sz w:val="14"/>
+                <w:szCs w:val="14"/>
+              </w:rPr>
+              <w:t xml:space="preserve">10 s</w:t>
+            </w:r>
+          </w:p>
+        </w:tc>
+        <w:tc>
+          <w:tcPr>
+            <w:tcW w:type="dxa" w:w="1349"/>
             <w:tcMar>
               <w:top w:type="dxa" w:w="60"/>
               <w:left w:type="dxa" w:w="80"/>
@@ -5551,7 +5706,7 @@
                 <w:sz w:val="14"/>
                 <w:szCs w:val="14"/>
               </w:rPr>
-              <w:t xml:space="preserve">Evaluación crítica y limitaciones</w:t>
+              <w:t xml:space="preserve">Impacto social y responsabilidad</w:t>
             </w:r>
           </w:p>
         </w:tc>
@@ -5603,7 +5758,7 @@
                 <w:sz w:val="14"/>
                 <w:szCs w:val="14"/>
               </w:rPr>
-              <w:t xml:space="preserve">Semáforo de criterios prefijados; limitaciones explícitas</w:t>
+              <w:t xml:space="preserve">Auditoría de equidad por jurisdicción; stakeholders y riesgos; compromisos; model card y datasheet</w:t>
             </w:r>
           </w:p>
         </w:tc>
@@ -5635,7 +5790,7 @@
                 <w:sz w:val="14"/>
                 <w:szCs w:val="14"/>
               </w:rPr>
-              <w:t xml:space="preserve">Conclusiones y trabajo futuro</w:t>
+              <w:t xml:space="preserve">Evaluación crítica y limitaciones</w:t>
             </w:r>
           </w:p>
         </w:tc>
@@ -5685,7 +5840,7 @@
                 <w:sz w:val="14"/>
                 <w:szCs w:val="14"/>
               </w:rPr>
-              <w:t xml:space="preserve">Tres conclusiones; cuatro líneas futuras</w:t>
+              <w:t xml:space="preserve">Semáforo de criterios prefijados; limitaciones explícitas</w:t>
             </w:r>
           </w:p>
         </w:tc>
@@ -5718,7 +5873,7 @@
                 <w:sz w:val="14"/>
                 <w:szCs w:val="14"/>
               </w:rPr>
-              <w:t xml:space="preserve">Reproducibilidad y ética de datos</w:t>
+              <w:t xml:space="preserve">Conclusiones y trabajo futuro</w:t>
             </w:r>
           </w:p>
         </w:tc>
@@ -5744,7 +5899,7 @@
                 <w:sz w:val="14"/>
                 <w:szCs w:val="14"/>
               </w:rPr>
-              <w:t xml:space="preserve">5, 18</w:t>
+              <w:t xml:space="preserve">18</w:t>
             </w:r>
           </w:p>
         </w:tc>
@@ -5770,7 +5925,89 @@
                 <w:sz w:val="14"/>
                 <w:szCs w:val="14"/>
               </w:rPr>
-              <w:t xml:space="preserve">Hash del corpus, semilla, cuaderno ejecutado, licencias, corpus no redistribuible</w:t>
+              <w:t xml:space="preserve">Tres conclusiones; cuatro líneas futuras</w:t>
+            </w:r>
+          </w:p>
+        </w:tc>
+      </w:tr>
+      <w:tr>
+        <w:trPr>
+          <w:cantSplit w:val="false"/>
+        </w:trPr>
+        <w:tc>
+          <w:tcPr>
+            <w:tcW w:type="dxa" w:w="2697"/>
+            <w:tcMar>
+              <w:top w:type="dxa" w:w="60"/>
+              <w:left w:type="dxa" w:w="80"/>
+              <w:bottom w:type="dxa" w:w="60"/>
+              <w:right w:type="dxa" w:w="80"/>
+            </w:tcMar>
+            <w:vAlign w:val="top"/>
+          </w:tcPr>
+          <w:p>
+            <w:pPr>
+              <w:spacing w:after="40" w:line="240"/>
+              <w:jc w:val="left"/>
+            </w:pPr>
+            <w:r>
+              <w:rPr>
+                <w:b/>
+                <w:bCs/>
+                <w:sz w:val="14"/>
+                <w:szCs w:val="14"/>
+              </w:rPr>
+              <w:t xml:space="preserve">Reproducibilidad y ética de datos</w:t>
+            </w:r>
+          </w:p>
+        </w:tc>
+        <w:tc>
+          <w:tcPr>
+            <w:tcW w:type="dxa" w:w="1245"/>
+            <w:tcMar>
+              <w:top w:type="dxa" w:w="60"/>
+              <w:left w:type="dxa" w:w="80"/>
+              <w:bottom w:type="dxa" w:w="60"/>
+              <w:right w:type="dxa" w:w="80"/>
+            </w:tcMar>
+            <w:vAlign w:val="top"/>
+          </w:tcPr>
+          <w:p>
+            <w:pPr>
+              <w:spacing w:after="40" w:line="240"/>
+              <w:jc w:val="left"/>
+            </w:pPr>
+            <w:r>
+              <w:rPr>
+                <w:sz w:val="14"/>
+                <w:szCs w:val="14"/>
+              </w:rPr>
+              <w:t xml:space="preserve">5, 16, 19</w:t>
+            </w:r>
+          </w:p>
+        </w:tc>
+        <w:tc>
+          <w:tcPr>
+            <w:tcW w:type="dxa" w:w="5470"/>
+            <w:tcMar>
+              <w:top w:type="dxa" w:w="60"/>
+              <w:left w:type="dxa" w:w="80"/>
+              <w:bottom w:type="dxa" w:w="60"/>
+              <w:right w:type="dxa" w:w="80"/>
+            </w:tcMar>
+            <w:vAlign w:val="top"/>
+          </w:tcPr>
+          <w:p>
+            <w:pPr>
+              <w:spacing w:after="40" w:line="240"/>
+              <w:jc w:val="left"/>
+            </w:pPr>
+            <w:r>
+              <w:rPr>
+                <w:sz w:val="14"/>
+                <w:szCs w:val="14"/>
+              </w:rPr>
+              <w:t xml:space="preserve">Hash del corpus, semilla, cuaderno ejecutado, licencias, corpus no redistribuible, datos personales de codificadores</w:t>
             </w:r>
           </w:p>
         </w:tc>
@@ -6477,7 +6714,7 @@
         <w:spacing w:after="80" w:before="200"/>
       </w:pPr>
       <w:r>
-        <w:t xml:space="preserve">Diapositiva 15 · Operación: codificación asistida, no automatización · 12:25 – 13:25 (60 s)</w:t>
+        <w:t xml:space="preserve">Diapositiva 15 · Operación: codificación asistida, no automatización · 12:25 – 13:10 (45 s)</w:t>
       </w:r>
     </w:p>
     <w:p>
@@ -6501,7 +6738,7 @@
           <w:sz w:val="18"/>
           <w:szCs w:val="18"/>
         </w:rPr>
-        <w:t xml:space="preserve"> Curva enrutamiento-exactitud y diagrama de operación; cifras 0.50 · 84 % · 22/136 · 5→2; recomendación.</w:t>
+        <w:t xml:space="preserve"> Curva enrutamiento-exactitud y diagrama de operación; cifras 0.50 · 84 % · 21/136 · 5→2; recomendación.</w:t>
       </w:r>
     </w:p>
     <w:p>
@@ -6510,7 +6747,7 @@
         <w:jc w:val="both"/>
       </w:pPr>
       <w:r>
-        <w:t xml:space="preserve">¿Puede el observatorio automatizar parte de la codificación? La curva de enrutamiento responde: para garantizar al menos 85 por ciento de exactitud en el tramo automático, el umbral de confianza debe ser 0.50, y con la regla completa —umbral, países con menos de 20 normas e idiomas minoritarios— el 84 por ciento de las normas va a revisión humana. La meta era 30 por ciento; el ahorro sería de 22 horas sobre 136 por pasada.</w:t>
+        <w:t xml:space="preserve">¿Puede el observatorio automatizar parte de la codificación? La curva de enrutamiento responde: para garantizar al menos 85 por ciento de exactitud en el tramo automático, el umbral de confianza debe ser 0.50, y con la regla completa el 84 por ciento de las normas va a revisión humana; la meta era 30 por ciento y el ahorro sería de 21 horas sobre 136 por pasada.</w:t>
       </w:r>
     </w:p>
     <w:p>
@@ -6519,7 +6756,7 @@
         <w:jc w:val="both"/>
       </w:pPr>
       <w:r>
-        <w:t xml:space="preserve">La conclusión operativa es codificación asistida, no automática: el modelo propone dos candidatas con su probabilidad, el codificador decide, y la tabla del índice registra por país cuántas normas tienen respaldo humano y cuántas solo del modelo, con un margen. El índice no queda a merced del modelo; el modelo reduce el espacio de decisión de cinco opciones a dos en el 85 por ciento de los casos.</w:t>
+        <w:t xml:space="preserve">La conclusión operativa es codificación asistida, no automática: el modelo propone dos candidatas con su probabilidad, el codificador decide, y la tabla del índice registra por país cuántas normas tienen respaldo humano y cuántas solo del modelo. El modelo reduce el espacio de decisión de cinco opciones a dos en el 85 por ciento de los casos.</w:t>
       </w:r>
     </w:p>
     <w:p>
@@ -6529,7 +6766,7 @@
         <w:spacing w:after="80" w:before="200"/>
       </w:pPr>
       <w:r>
-        <w:t xml:space="preserve">Diapositiva 16 · Contraste con los umbrales prefijados y limitaciones · 13:25 – 14:10 (45 s)</w:t>
+        <w:t xml:space="preserve">Diapositiva 16 · Impacto social y responsabilidad · 13:10 – 13:55 (45 s)</w:t>
       </w:r>
     </w:p>
     <w:p>
@@ -6553,7 +6790,7 @@
           <w:sz w:val="18"/>
           <w:szCs w:val="18"/>
         </w:rPr>
-        <w:t xml:space="preserve"> Tabla semáforo de criterios prefijados (cumplido / en el borde / no alcanzado); lista de limitaciones.</w:t>
+        <w:t xml:space="preserve"> Figura de la auditoría de equidad por jurisdicción (exactitud por grupo y % enviado a revisión humana); tarjetas de stakeholders/riesgos y compromisos.</w:t>
       </w:r>
     </w:p>
     <w:p>
@@ -6562,16 +6799,7 @@
         <w:jc w:val="both"/>
       </w:pPr>
       <w:r>
-        <w:t xml:space="preserve">Contrastamos cada resultado con el criterio prefijado. Superar ambas líneas base con significancia: cumplido. F1 macro mínimo de 0.60: en el borde, 0.587 en validación cruzada y 0.617 en el conjunto ciego. Excelencia de 0.70: no alcanzado. Ninguna clase bajo 0.40: incumplido por Técnico. Kappa de 0.60: no alcanzado, con 0.50 y 0.56. Enrutar menos del 30 por ciento con 85 por ciento de exactitud: no viable.</w:t>
-      </w:r>
-    </w:p>
-    <w:p>
-      <w:pPr>
-        <w:spacing w:after="90" w:before="0" w:line="259"/>
-        <w:jc w:val="both"/>
-      </w:pPr>
-      <w:r>
-        <w:t xml:space="preserve">Las limitaciones: un solo codificador por norma en la referencia, así que parte del error puede ser desacuerdo legítimo; el kappa humano-humano sigue pendiente y la plantilla para obtenerlo está generada. Texto corto y en parte redactado por el codificador. Conjunto ciego pequeño. Y la rama LLM pendiente de ejecución.</w:t>
+        <w:t xml:space="preserve">El impacto social del sistema está en el índice que compara países. Auditamos la equidad por jurisdicción: el modelo acierta 0.67 en Hispanoamérica continental, 0.47 en Brasil y 0.38 en el Caribe. Automatizado sin salvaguardas, el índice invisibilizaría justo a las jurisdicciones que un observatorio regional debería hacer visibles. La regla de gobernanza envía a revisión humana el cien por ciento de esas normas, y la auditoría nos obligó a corregirla: Brasil quedaba fuera y lo incorporamos. El nombre del codificador es un dato personal que se excluye y anonimiza; bajo la Ley de IA europea el sistema es de riesgo mínimo, pero adoptamos voluntariamente model card, datasheet y plan de incidentes. Compromiso: ninguna cifra del índice sin revisión humana en los grupos en riesgo, siempre con su margen, y nunca para evaluar a codificadores.</w:t>
       </w:r>
     </w:p>
     <w:p>
@@ -6581,7 +6809,7 @@
         <w:spacing w:after="80" w:before="200"/>
       </w:pPr>
       <w:r>
-        <w:t xml:space="preserve">Diapositiva 17 · Conclusiones y trabajo futuro · 14:10 – 14:50 (40 s)</w:t>
+        <w:t xml:space="preserve">Diapositiva 17 · Contraste con los umbrales prefijados y limitaciones · 13:55 – 14:25 (30 s)</w:t>
       </w:r>
     </w:p>
     <w:p>
@@ -6605,7 +6833,7 @@
           <w:sz w:val="18"/>
           <w:szCs w:val="18"/>
         </w:rPr>
-        <w:t xml:space="preserve"> Tres conclusiones en tarjetas; cuatro líneas de trabajo futuro.</w:t>
+        <w:t xml:space="preserve"> Tabla semáforo de criterios prefijados (cumplido / en el borde / no alcanzado); lista de limitaciones.</w:t>
       </w:r>
     </w:p>
     <w:p>
@@ -6614,7 +6842,7 @@
         <w:jc w:val="both"/>
       </w:pPr>
       <w:r>
-        <w:t xml:space="preserve">Tres conclusiones. Primera: con 813 normas y texto corto, un modelo lineal interpretable aprende la estructura del framework GENIAL y supera con significancia a cualquier heurística sin IA, pero no alcanza la calidad necesaria para sustituir al codificador. Segunda: el valor del clasificador está en la asistencia —dos candidatas correctas en el 85 por ciento de los casos— y en el diagnóstico: sus errores señalan normas de frontera y dimensiones cuya definición conviene revisar. Tercera: los umbrales prefijados, los intervalos de confianza y las pruebas pareadas son lo que permite decir esto con rigor en lugar de celebrar una cifra.</w:t>
+        <w:t xml:space="preserve">Contrastamos cada resultado con el criterio prefijado. Superar ambas líneas base con significancia: cumplido. F1 macro mínimo de 0.60: en el borde, 0.587 en validación cruzada y 0.617 en el conjunto ciego. Excelencia de 0.70: no alcanzado. Ninguna clase bajo 0.40: incumplido por Técnico. Kappa de 0.60: no alcanzado, con 0.50 y 0.56. Enrutar menos del 30 por ciento con 85 por ciento de exactitud: no viable.</w:t>
       </w:r>
     </w:p>
     <w:p>
@@ -6623,7 +6851,7 @@
         <w:jc w:val="both"/>
       </w:pPr>
       <w:r>
-        <w:t xml:space="preserve">Como trabajo futuro: cerrar la comparación con la rama LLM few-shot; incorporar la doble codificación para medir el techo humano; ampliar el texto de entrada con el cuerpo de la norma; y evaluar un esquema explícitamente multi-etiqueta cuando la tipificación de errores lo justifique.</w:t>
+        <w:t xml:space="preserve">Las limitaciones: un solo codificador por norma en la referencia, así que parte del error puede ser desacuerdo legítimo; el kappa humano-humano sigue pendiente y la plantilla para obtenerlo está generada. Texto corto y en parte redactado por el codificador. Conjunto ciego pequeño. Y la rama LLM pendiente de ejecución.</w:t>
       </w:r>
     </w:p>
     <w:p>
@@ -6633,7 +6861,7 @@
         <w:spacing w:after="80" w:before="200"/>
       </w:pPr>
       <w:r>
-        <w:t xml:space="preserve">Diapositiva 18 · Cierre · 14:50 – 15:00 (10 s)</w:t>
+        <w:t xml:space="preserve">Diapositiva 18 · Conclusiones y trabajo futuro · 14:25 – 14:50 (25 s)</w:t>
       </w:r>
     </w:p>
     <w:p>
@@ -6657,6 +6885,58 @@
           <w:sz w:val="18"/>
           <w:szCs w:val="18"/>
         </w:rPr>
+        <w:t xml:space="preserve"> Tres conclusiones en tarjetas; cuatro líneas de trabajo futuro.</w:t>
+      </w:r>
+    </w:p>
+    <w:p>
+      <w:pPr>
+        <w:spacing w:after="90" w:before="0" w:line="259"/>
+        <w:jc w:val="both"/>
+      </w:pPr>
+      <w:r>
+        <w:t xml:space="preserve">Tres conclusiones. Primera: con 813 normas y texto corto, un modelo lineal interpretable aprende la estructura del framework GENIAL y supera con significancia a toda heurística sin IA, pero no alcanza la calidad para sustituir al codificador. Segunda: su valor está en la asistencia —dos candidatas correctas en el 85 por ciento de los casos— y en el diagnóstico: sus errores señalan normas de frontera y dimensiones cuya definición conviene revisar. Tercera: umbrales prefijados, intervalos de confianza y pruebas pareadas permiten decirlo con rigor.</w:t>
+      </w:r>
+    </w:p>
+    <w:p>
+      <w:pPr>
+        <w:spacing w:after="90" w:before="0" w:line="259"/>
+        <w:jc w:val="both"/>
+      </w:pPr>
+      <w:r>
+        <w:t xml:space="preserve">Trabajo futuro: cerrar la comparación con la rama LLM, medir el techo humano con doble codificación, ampliar el texto de entrada y evaluar un esquema multi-etiqueta.</w:t>
+      </w:r>
+    </w:p>
+    <w:p>
+      <w:pPr>
+        <w:pStyle w:val="Heading3"/>
+        <w:keepNext/>
+        <w:spacing w:after="80" w:before="200"/>
+      </w:pPr>
+      <w:r>
+        <w:t xml:space="preserve">Diapositiva 19 · Cierre · 14:50 – 15:00 (10 s)</w:t>
+      </w:r>
+    </w:p>
+    <w:p>
+      <w:pPr>
+        <w:spacing w:after="90" w:before="0" w:line="259"/>
+        <w:jc w:val="both"/>
+      </w:pPr>
+      <w:r>
+        <w:rPr>
+          <w:b/>
+          <w:bCs/>
+          <w:color w:val="6E6862"/>
+          <w:sz w:val="18"/>
+          <w:szCs w:val="18"/>
+        </w:rPr>
+        <w:t xml:space="preserve">[pantalla]</w:t>
+      </w:r>
+      <w:r>
+        <w:rPr>
+          <w:color w:val="6E6862"/>
+          <w:sz w:val="18"/>
+          <w:szCs w:val="18"/>
+        </w:rPr>
         <w:t xml:space="preserve"> Cierre: repositorio, reproducibilidad, agradecimientos.</w:t>
       </w:r>
     </w:p>
@@ -6732,7 +7012,7 @@
         <w:jc w:val="both"/>
       </w:pPr>
       <w:r>
-        <w:t xml:space="preserve">Si la rama LLM se ejecuta antes de grabar, actualizar la fila «LLM few-shot» de la diapositiva 12, el punto 6 de la lectura del cuaderno y las frases correspondientes de los bloques 12 y 16.</w:t>
+        <w:t xml:space="preserve">Si la rama LLM se ejecuta antes de grabar, actualizar la fila «LLM few-shot» de la diapositiva 12, el punto 6 de la lectura del cuaderno y las frases correspondientes de los bloques 12 y 17.</w:t>
       </w:r>
     </w:p>
     <w:p>
@@ -6756,7 +7036,7 @@
         <w:t xml:space="preserve">results/coder2_labels_plantilla.csv</w:t>
       </w:r>
       <w:r>
-        <w:t xml:space="preserve">), el cuaderno calcula κ humano-humano al re-ejecutarse; actualizar entonces las diapositivas 14 y 16 y los bloques 14 y 16 del guion.</w:t>
+        <w:t xml:space="preserve">), el cuaderno calcula κ humano-humano al re-ejecutarse; actualizar entonces las diapositivas 14 y 17 y los bloques 14 y 17 del guion.</w:t>
       </w:r>
     </w:p>
     <w:p>

</xml_diff>